<commit_message>
Cada dato de su documento, acreditado y conyuge del acto elegido, plantilla CDMX_MUTUO_H_CASADO
</commit_message>
<xml_diff>
--- a/backend/templates/CDMX_MUTUO_H_CASADO.docx
+++ b/backend/templates/CDMX_MUTUO_H_CASADO.docx
@@ -1929,6 +1929,81 @@
       <w:r>
         <w:rPr>
           <w:rFonts w:ascii="Arial" w:hAnsi="Arial" w:cs="Arial"/>
+          <w:bCs/>
+          <w:sz w:val="14"/>
+          <w:szCs w:val="14"/>
+        </w:rPr>
+        <w:t xml:space="preserve"> </w:t>
+      </w:r>
+      <w:r>
+        <w:rPr>
+          <w:rFonts w:ascii="Arial" w:eastAsia="Batang" w:hAnsi="Arial" w:cs="Arial"/>
+          <w:bCs/>
+          <w:sz w:val="14"/>
+          <w:szCs w:val="14"/>
+        </w:rPr>
+        <w:t xml:space="preserve">con el consentimiento de su </w:t>
+      </w:r>
+      <w:commentRangeStart w:id="5"/>
+      <w:r>
+        <w:rPr>
+          <w:rFonts w:ascii="Arial" w:eastAsia="Batang" w:hAnsi="Arial" w:cs="Arial"/>
+          <w:bCs/>
+          <w:sz w:val="14"/>
+          <w:szCs w:val="14"/>
+        </w:rPr>
+        <w:t xml:space="preserve">cónyuge </w:t>
+      </w:r>
+      <w:commentRangeEnd w:id="5"/>
+      <w:r>
+        <w:rPr>
+          <w:rStyle w:val="Refdecomentario"/>
+          <w:rFonts w:ascii="Arial" w:eastAsia="Batang" w:hAnsi="Arial" w:cs="Arial"/>
+          <w:bCs/>
+          <w:sz w:val="14"/>
+          <w:szCs w:val="14"/>
+        </w:rPr>
+        <w:commentReference w:id="5"/>
+      </w:r>
+      <w:r>
+        <w:rPr>
+          <w:rFonts w:ascii="Arial" w:eastAsia="Batang" w:hAnsi="Arial" w:cs="Arial"/>
+          <w:bCs/>
+          <w:sz w:val="14"/>
+          <w:szCs w:val="14"/>
+        </w:rPr>
+        <w:t xml:space="preserve">la señora </w:t>
+      </w:r>
+      <w:r>
+        <w:rPr>
+          <w:rFonts w:ascii="Arial" w:eastAsia="Batang" w:hAnsi="Arial" w:cs="Arial"/>
+          <w:b/>
+          <w:sz w:val="14"/>
+          <w:szCs w:val="14"/>
+        </w:rPr>
+        <w:t>{{ nombre_conyug</w:t>
+      </w:r>
+      <w:r>
+        <w:rPr>
+          <w:rFonts w:ascii="Arial" w:eastAsia="Batang" w:hAnsi="Arial" w:cs="Arial"/>
+          <w:b/>
+          <w:sz w:val="14"/>
+          <w:szCs w:val="14"/>
+        </w:rPr>
+        <w:t>u</w:t>
+      </w:r>
+      <w:r>
+        <w:rPr>
+          <w:rFonts w:ascii="Arial" w:eastAsia="Batang" w:hAnsi="Arial" w:cs="Arial"/>
+          <w:b/>
+          <w:sz w:val="14"/>
+          <w:szCs w:val="14"/>
+        </w:rPr>
+        <w:t>e }}</w:t>
+      </w:r>
+      <w:r>
+        <w:rPr>
+          <w:rFonts w:ascii="Arial" w:hAnsi="Arial" w:cs="Arial"/>
           <w:b/>
           <w:bCs/>
           <w:sz w:val="14"/>
@@ -3944,7 +4019,7 @@
         </w:rPr>
         <w:t xml:space="preserve"> </w:t>
       </w:r>
-      <w:bookmarkStart w:id="5" w:name="_Hlk164260665"/>
+      <w:bookmarkStart w:id="6" w:name="_Hlk164260665"/>
       <w:r>
         <w:rPr>
           <w:rFonts w:ascii="Arial" w:hAnsi="Arial" w:cs="Arial"/>
@@ -3953,7 +4028,7 @@
         </w:rPr>
         <w:t>declara ser de nacionalidad mexicana,</w:t>
       </w:r>
-      <w:bookmarkEnd w:id="5"/>
+      <w:bookmarkEnd w:id="6"/>
       <w:r>
         <w:rPr>
           <w:rFonts w:ascii="Arial" w:hAnsi="Arial" w:cs="Arial"/>
@@ -4208,7 +4283,7 @@
         </w:rPr>
         <w:tab/>
       </w:r>
-      <w:bookmarkStart w:id="6" w:name="_Hlk519588694"/>
+      <w:bookmarkStart w:id="7" w:name="_Hlk519588694"/>
     </w:p>
     <w:p>
       <w:pPr>
@@ -4312,7 +4387,7 @@
         </w:rPr>
         <w:t xml:space="preserve">.- De conformidad con lo establecido en la Ley Federal de Protección de Datos Personales en Posesión de los Particulares y su Reglamento, hice saber y expliqué a la compareciente de este instrumento, el contenido íntegro del aviso de privacidad que se encuentra exhibido en diversas áreas de las oficinas del suscrito Notario y en la página de internet </w:t>
       </w:r>
-      <w:hyperlink r:id="rId8" w:history="1">
+      <w:hyperlink r:id="rId11" w:history="1">
         <w:r>
           <w:rPr>
             <w:rStyle w:val="Hipervnculo"/>
@@ -4339,7 +4414,7 @@
         </w:rPr>
         <w:tab/>
       </w:r>
-      <w:bookmarkEnd w:id="6"/>
+      <w:bookmarkEnd w:id="7"/>
     </w:p>
     <w:p>
       <w:pPr>
@@ -5442,8 +5517,8 @@
       </w:pPr>
     </w:p>
     <w:sectPr>
-      <w:headerReference w:type="default" r:id="rId9"/>
-      <w:footerReference w:type="default" r:id="rId10"/>
+      <w:headerReference w:type="default" r:id="rId12"/>
+      <w:footerReference w:type="default" r:id="rId13"/>
       <w:pgSz w:w="12240" w:h="19293" w:code="305"/>
       <w:pgMar w:top="2552" w:right="1418" w:bottom="1701" w:left="1701" w:header="2098" w:footer="567" w:gutter="0"/>
       <w:cols w:space="708"/>
@@ -5451,6 +5526,39 @@
     </w:sectPr>
   </w:body>
 </w:document>
+</file>
+
+<file path=word/comments.xml><?xml version="1.0" encoding="utf-8"?>
+<w:comments xmlns:wpc="http://schemas.microsoft.com/office/word/2010/wordprocessingCanvas" xmlns:cx="http://schemas.microsoft.com/office/drawing/2014/chartex" xmlns:cx1="http://schemas.microsoft.com/office/drawing/2015/9/8/chartex" xmlns:cx2="http://schemas.microsoft.com/office/drawing/2015/10/21/chartex" xmlns:cx3="http://schemas.microsoft.com/office/drawing/2016/5/9/chartex" xmlns:cx4="http://schemas.microsoft.com/office/drawing/2016/5/10/chartex" xmlns:cx5="http://schemas.microsoft.com/office/drawing/2016/5/11/chartex" xmlns:cx6="http://schemas.microsoft.com/office/drawing/2016/5/12/chartex" xmlns:cx7="http://schemas.microsoft.com/office/drawing/2016/5/13/chartex" xmlns:cx8="http://schemas.microsoft.com/office/drawing/2016/5/14/chartex" xmlns:mc="http://schemas.openxmlformats.org/markup-compatibility/2006" xmlns:aink="http://schemas.microsoft.com/office/drawing/2016/ink" xmlns:am3d="http://schemas.microsoft.com/office/drawing/2017/model3d" xmlns:o="urn:schemas-microsoft-com:office:office" xmlns:oel="http://schemas.microsoft.com/office/2019/extlst" xmlns:r="http://schemas.openxmlformats.org/officeDocument/2006/relationships" xmlns:m="http://schemas.openxmlformats.org/officeDocument/2006/math" xmlns:v="urn:schemas-microsoft-com:vml" xmlns:wp14="http://schemas.microsoft.com/office/word/2010/wordprocessingDrawing" xmlns:wp="http://schemas.openxmlformats.org/drawingml/2006/wordprocessingDrawing" xmlns:w10="urn:schemas-microsoft-com:office:word" xmlns:w="http://schemas.openxmlformats.org/wordprocessingml/2006/main" xmlns:w14="http://schemas.microsoft.com/office/word/2010/wordml" xmlns:w15="http://schemas.microsoft.com/office/word/2012/wordml" xmlns:w16cex="http://schemas.microsoft.com/office/word/2018/wordml/cex" xmlns:w16cid="http://schemas.microsoft.com/office/word/2016/wordml/cid" xmlns:w16="http://schemas.microsoft.com/office/word/2018/wordml" xmlns:w16du="http://schemas.microsoft.com/office/word/2023/wordml/word16du" xmlns:w16sdtdh="http://schemas.microsoft.com/office/word/2020/wordml/sdtdatahash" xmlns:w16sdtfl="http://schemas.microsoft.com/office/word/2024/wordml/sdtformatlock" xmlns:w16se="http://schemas.microsoft.com/office/word/2015/wordml/symex" xmlns:wpg="http://schemas.microsoft.com/office/word/2010/wordprocessingGroup" xmlns:wpi="http://schemas.microsoft.com/office/word/2010/wordprocessingInk" xmlns:wne="http://schemas.microsoft.com/office/word/2006/wordml" xmlns:wps="http://schemas.microsoft.com/office/word/2010/wordprocessingShape" mc:Ignorable="w14 w15 w16se w16cid w16 w16cex w16sdtdh w16sdtfl w16du wp14">
+  <w:comment w:id="5" w:author="Soporte Sistemas" w:date="2025-12-18T15:04:00Z" w:initials="SS">
+    <w:p>
+      <w:pPr>
+        <w:pStyle w:val="Textocomentario"/>
+      </w:pPr>
+      <w:r>
+        <w:rPr>
+          <w:rStyle w:val="Refdecomentario"/>
+        </w:rPr>
+        <w:annotationRef/>
+      </w:r>
+      <w:r>
+        <w:t>#7. NOMBRE DEL CÓNYUGE</w:t>
+      </w:r>
+    </w:p>
+  </w:comment>
+</w:comments>
+</file>
+
+<file path=word/commentsExtended.xml><?xml version="1.0" encoding="utf-8"?>
+<w15:commentsEx xmlns:wpc="http://schemas.microsoft.com/office/word/2010/wordprocessingCanvas" xmlns:cx="http://schemas.microsoft.com/office/drawing/2014/chartex" xmlns:cx1="http://schemas.microsoft.com/office/drawing/2015/9/8/chartex" xmlns:cx2="http://schemas.microsoft.com/office/drawing/2015/10/21/chartex" xmlns:cx3="http://schemas.microsoft.com/office/drawing/2016/5/9/chartex" xmlns:cx4="http://schemas.microsoft.com/office/drawing/2016/5/10/chartex" xmlns:cx5="http://schemas.microsoft.com/office/drawing/2016/5/11/chartex" xmlns:cx6="http://schemas.microsoft.com/office/drawing/2016/5/12/chartex" xmlns:cx7="http://schemas.microsoft.com/office/drawing/2016/5/13/chartex" xmlns:cx8="http://schemas.microsoft.com/office/drawing/2016/5/14/chartex" xmlns:mc="http://schemas.openxmlformats.org/markup-compatibility/2006" xmlns:aink="http://schemas.microsoft.com/office/drawing/2016/ink" xmlns:am3d="http://schemas.microsoft.com/office/drawing/2017/model3d" xmlns:o="urn:schemas-microsoft-com:office:office" xmlns:oel="http://schemas.microsoft.com/office/2019/extlst" xmlns:r="http://schemas.openxmlformats.org/officeDocument/2006/relationships" xmlns:m="http://schemas.openxmlformats.org/officeDocument/2006/math" xmlns:v="urn:schemas-microsoft-com:vml" xmlns:wp14="http://schemas.microsoft.com/office/word/2010/wordprocessingDrawing" xmlns:wp="http://schemas.openxmlformats.org/drawingml/2006/wordprocessingDrawing" xmlns:w10="urn:schemas-microsoft-com:office:word" xmlns:w="http://schemas.openxmlformats.org/wordprocessingml/2006/main" xmlns:w14="http://schemas.microsoft.com/office/word/2010/wordml" xmlns:w15="http://schemas.microsoft.com/office/word/2012/wordml" xmlns:w16cex="http://schemas.microsoft.com/office/word/2018/wordml/cex" xmlns:w16cid="http://schemas.microsoft.com/office/word/2016/wordml/cid" xmlns:w16="http://schemas.microsoft.com/office/word/2018/wordml" xmlns:w16du="http://schemas.microsoft.com/office/word/2023/wordml/word16du" xmlns:w16sdtdh="http://schemas.microsoft.com/office/word/2020/wordml/sdtdatahash" xmlns:w16sdtfl="http://schemas.microsoft.com/office/word/2024/wordml/sdtformatlock" xmlns:w16se="http://schemas.microsoft.com/office/word/2015/wordml/symex" xmlns:wpg="http://schemas.microsoft.com/office/word/2010/wordprocessingGroup" xmlns:wpi="http://schemas.microsoft.com/office/word/2010/wordprocessingInk" xmlns:wne="http://schemas.microsoft.com/office/word/2006/wordml" xmlns:wps="http://schemas.microsoft.com/office/word/2010/wordprocessingShape" mc:Ignorable="w14 w15 w16se w16cid w16 w16cex w16sdtdh w16sdtfl w16du wp14">
+  <w15:commentEx w15:paraId="1B04D5AB" w15:done="0"/>
+</w15:commentsEx>
+</file>
+
+<file path=word/commentsIds.xml><?xml version="1.0" encoding="utf-8"?>
+<w16cid:commentsIds xmlns:wpc="http://schemas.microsoft.com/office/word/2010/wordprocessingCanvas" xmlns:cx="http://schemas.microsoft.com/office/drawing/2014/chartex" xmlns:cx1="http://schemas.microsoft.com/office/drawing/2015/9/8/chartex" xmlns:cx2="http://schemas.microsoft.com/office/drawing/2015/10/21/chartex" xmlns:cx3="http://schemas.microsoft.com/office/drawing/2016/5/9/chartex" xmlns:cx4="http://schemas.microsoft.com/office/drawing/2016/5/10/chartex" xmlns:cx5="http://schemas.microsoft.com/office/drawing/2016/5/11/chartex" xmlns:cx6="http://schemas.microsoft.com/office/drawing/2016/5/12/chartex" xmlns:cx7="http://schemas.microsoft.com/office/drawing/2016/5/13/chartex" xmlns:cx8="http://schemas.microsoft.com/office/drawing/2016/5/14/chartex" xmlns:mc="http://schemas.openxmlformats.org/markup-compatibility/2006" xmlns:aink="http://schemas.microsoft.com/office/drawing/2016/ink" xmlns:am3d="http://schemas.microsoft.com/office/drawing/2017/model3d" xmlns:o="urn:schemas-microsoft-com:office:office" xmlns:oel="http://schemas.microsoft.com/office/2019/extlst" xmlns:r="http://schemas.openxmlformats.org/officeDocument/2006/relationships" xmlns:m="http://schemas.openxmlformats.org/officeDocument/2006/math" xmlns:v="urn:schemas-microsoft-com:vml" xmlns:wp14="http://schemas.microsoft.com/office/word/2010/wordprocessingDrawing" xmlns:wp="http://schemas.openxmlformats.org/drawingml/2006/wordprocessingDrawing" xmlns:w10="urn:schemas-microsoft-com:office:word" xmlns:w="http://schemas.openxmlformats.org/wordprocessingml/2006/main" xmlns:w14="http://schemas.microsoft.com/office/word/2010/wordml" xmlns:w15="http://schemas.microsoft.com/office/word/2012/wordml" xmlns:w16cex="http://schemas.microsoft.com/office/word/2018/wordml/cex" xmlns:w16cid="http://schemas.microsoft.com/office/word/2016/wordml/cid" xmlns:w16="http://schemas.microsoft.com/office/word/2018/wordml" xmlns:w16du="http://schemas.microsoft.com/office/word/2023/wordml/word16du" xmlns:w16sdtdh="http://schemas.microsoft.com/office/word/2020/wordml/sdtdatahash" xmlns:w16sdtfl="http://schemas.microsoft.com/office/word/2024/wordml/sdtformatlock" xmlns:w16se="http://schemas.microsoft.com/office/word/2015/wordml/symex" xmlns:wpg="http://schemas.microsoft.com/office/word/2010/wordprocessingGroup" xmlns:wpi="http://schemas.microsoft.com/office/word/2010/wordprocessingInk" xmlns:wne="http://schemas.microsoft.com/office/word/2006/wordml" xmlns:wps="http://schemas.microsoft.com/office/word/2010/wordprocessingShape" mc:Ignorable="w14 w15 w16se w16cid w16 w16cex w16sdtdh w16sdtfl w16du wp14">
+  <w16cid:commentId w16cid:paraId="1B04D5AB" w16cid:durableId="3219EDB3"/>
+</w16cid:commentsIds>
 </file>
 
 <file path=word/endnotes.xml><?xml version="1.0" encoding="utf-8"?>

</xml_diff>